<commit_message>
v8.8.81: UI redesign with colored important buttons, add missing GUI buttons, cleanup junk files
- UI: Colored buttons now use Label controls for guaranteed square corners (no Windows theme rounding)
- UI: Important action buttons restored with color coding (green=primary, blue=secondary, purple=batch, red=destructive, orange=warning)
- Fix: Added missing  button to Copy Style tab
- Fix: Added 3 missing PDFFix buttons (Clean Up++, Fix Bang, Fix Justify) for previously unreachable functions
- Cleanup: Removed old versioned exe files, old release archives, empty .codex folder, empty CopyStyle_Refactored.au3
- Updated .gitignore to exclude versioned exe and release notes
</commit_message>
<xml_diff>
--- a/Tests/Artifacts/DocumentOps/batch1.docx
+++ b/Tests/Artifacts/DocumentOps/batch1.docx
@@ -93,16 +93,15 @@
     <w:rPrDefault>
       <w:rPr>
         <w:rFonts w:asciiTheme="minorHAnsi" w:eastAsiaTheme="minorEastAsia" w:hAnsiTheme="minorHAnsi" w:cstheme="minorBidi"/>
-        <w:kern w:val="2"/>
-        <w:sz w:val="24"/>
-        <w:szCs w:val="24"/>
-        <w:lang w:val="vi-VN" w:eastAsia="zh-CN" w:bidi="ar-SA"/>
+        <w:sz w:val="22"/>
+        <w:szCs w:val="22"/>
+        <w:lang w:val="en-US" w:eastAsia="zh-CN" w:bidi="ar-SA"/>
         <w14:ligatures w14:val="standardContextual"/>
       </w:rPr>
     </w:rPrDefault>
     <w:pPrDefault>
       <w:pPr>
-        <w:spacing w:after="160" w:line="278" w:lineRule="auto"/>
+        <w:spacing w:after="160" w:line="259" w:lineRule="auto"/>
       </w:pPr>
     </w:pPrDefault>
   </w:docDefaults>
@@ -493,10 +492,6 @@
     </w:pPr>
     <w:rPr>
       <w:rFonts w:ascii="Calibri" w:hAnsi="Calibri" w:cs="Times New Roman"/>
-      <w:kern w:val="0"/>
-      <w:sz w:val="22"/>
-      <w:szCs w:val="22"/>
-      <w:lang w:val="en-US"/>
       <w14:ligatures w14:val="none"/>
     </w:rPr>
   </w:style>
@@ -507,7 +502,7 @@
     <w:link w:val="Heading1Char"/>
     <w:uiPriority w:val="9"/>
     <w:qFormat/>
-    <w:rsid w:val="008D193D"/>
+    <w:rsid w:val="0021687E"/>
     <w:pPr>
       <w:keepNext/>
       <w:keepLines/>
@@ -576,7 +571,7 @@
     <w:semiHidden/>
     <w:unhideWhenUsed/>
     <w:qFormat/>
-    <w:rsid w:val="00B81830"/>
+    <w:rsid w:val="00E918B2"/>
     <w:pPr>
       <w:keepNext/>
       <w:keepLines/>
@@ -599,7 +594,7 @@
     <w:semiHidden/>
     <w:unhideWhenUsed/>
     <w:qFormat/>
-    <w:rsid w:val="00B81830"/>
+    <w:rsid w:val="00E918B2"/>
     <w:pPr>
       <w:keepNext/>
       <w:keepLines/>
@@ -620,7 +615,7 @@
     <w:semiHidden/>
     <w:unhideWhenUsed/>
     <w:qFormat/>
-    <w:rsid w:val="00B81830"/>
+    <w:rsid w:val="00E918B2"/>
     <w:pPr>
       <w:keepNext/>
       <w:keepLines/>
@@ -643,7 +638,7 @@
     <w:semiHidden/>
     <w:unhideWhenUsed/>
     <w:qFormat/>
-    <w:rsid w:val="00B81830"/>
+    <w:rsid w:val="00E918B2"/>
     <w:pPr>
       <w:keepNext/>
       <w:keepLines/>
@@ -664,7 +659,7 @@
     <w:semiHidden/>
     <w:unhideWhenUsed/>
     <w:qFormat/>
-    <w:rsid w:val="00B81830"/>
+    <w:rsid w:val="00E918B2"/>
     <w:pPr>
       <w:keepNext/>
       <w:keepLines/>
@@ -687,7 +682,7 @@
     <w:semiHidden/>
     <w:unhideWhenUsed/>
     <w:qFormat/>
-    <w:rsid w:val="00B81830"/>
+    <w:rsid w:val="00E918B2"/>
     <w:pPr>
       <w:keepNext/>
       <w:keepLines/>
@@ -731,14 +726,12 @@
     <w:basedOn w:val="DefaultParagraphFont"/>
     <w:link w:val="Heading1"/>
     <w:uiPriority w:val="9"/>
-    <w:rsid w:val="008D193D"/>
+    <w:rsid w:val="0021687E"/>
     <w:rPr>
       <w:rFonts w:asciiTheme="majorHAnsi" w:eastAsiaTheme="majorEastAsia" w:hAnsiTheme="majorHAnsi" w:cstheme="majorBidi"/>
       <w:color w:val="0F4761" w:themeColor="accent1" w:themeShade="BF"/>
-      <w:kern w:val="0"/>
       <w:sz w:val="40"/>
       <w:szCs w:val="40"/>
-      <w:lang w:val="en-US"/>
       <w14:ligatures w14:val="none"/>
     </w:rPr>
   </w:style>
@@ -779,19 +772,17 @@
   <w:style w:type="paragraph" w:customStyle="1" w:styleId="0NOIDUNG">
     <w:name w:val="0NOIDUNG"/>
     <w:qFormat/>
-    <w:rsid w:val="004D7ECF"/>
+    <w:rsid w:val="006C50BC"/>
     <w:pPr>
       <w:widowControl w:val="0"/>
-      <w:spacing w:before="120" w:after="0" w:line="360" w:lineRule="auto"/>
+      <w:spacing w:before="200" w:after="0" w:line="360" w:lineRule="auto"/>
       <w:ind w:firstLine="567"/>
       <w:jc w:val="both"/>
     </w:pPr>
     <w:rPr>
       <w:rFonts w:ascii="Times New Roman" w:eastAsiaTheme="majorEastAsia" w:hAnsi="Times New Roman" w:cstheme="majorBidi"/>
-      <w:kern w:val="0"/>
       <w:sz w:val="26"/>
-      <w:szCs w:val="22"/>
-      <w:lang w:val="en-US"/>
+      <w:lang w:eastAsia="en-US"/>
       <w14:ligatures w14:val="none"/>
     </w:rPr>
   </w:style>
@@ -799,12 +790,11 @@
     <w:name w:val="0LV2"/>
     <w:basedOn w:val="Heading1"/>
     <w:qFormat/>
-    <w:rsid w:val="004D7ECF"/>
+    <w:rsid w:val="008C1C00"/>
     <w:pPr>
       <w:keepNext w:val="0"/>
       <w:keepLines w:val="0"/>
       <w:spacing w:before="120" w:after="240" w:line="240" w:lineRule="auto"/>
-      <w:jc w:val="both"/>
     </w:pPr>
     <w:rPr>
       <w:rFonts w:ascii="Times New Roman" w:eastAsiaTheme="minorHAnsi" w:hAnsi="Times New Roman" w:cstheme="minorBidi"/>
@@ -812,13 +802,14 @@
       <w:color w:val="auto"/>
       <w:sz w:val="26"/>
       <w:szCs w:val="22"/>
+      <w:lang w:eastAsia="en-US"/>
     </w:rPr>
   </w:style>
   <w:style w:type="paragraph" w:customStyle="1" w:styleId="0LV3">
     <w:name w:val="0LV3"/>
     <w:basedOn w:val="Heading1"/>
     <w:qFormat/>
-    <w:rsid w:val="004D7ECF"/>
+    <w:rsid w:val="008C1C00"/>
     <w:pPr>
       <w:keepNext w:val="0"/>
       <w:keepLines w:val="0"/>
@@ -827,10 +818,10 @@
     <w:rPr>
       <w:rFonts w:ascii="Times New Roman" w:eastAsiaTheme="minorHAnsi" w:hAnsi="Times New Roman" w:cstheme="minorBidi"/>
       <w:b/>
-      <w:i/>
       <w:color w:val="auto"/>
       <w:sz w:val="26"/>
       <w:szCs w:val="22"/>
+      <w:lang w:eastAsia="en-US"/>
     </w:rPr>
   </w:style>
   <w:style w:type="paragraph" w:customStyle="1" w:styleId="0LV4">
@@ -871,22 +862,55 @@
       <w:szCs w:val="18"/>
     </w:rPr>
   </w:style>
+  <w:style w:type="paragraph" w:customStyle="1" w:styleId="0LV1">
+    <w:name w:val="0LV1"/>
+    <w:basedOn w:val="Heading1"/>
+    <w:link w:val="0LV1Char"/>
+    <w:qFormat/>
+    <w:rsid w:val="008C1C00"/>
+    <w:pPr>
+      <w:keepNext w:val="0"/>
+      <w:keepLines w:val="0"/>
+      <w:spacing w:before="0" w:after="480" w:line="240" w:lineRule="auto"/>
+      <w:ind w:firstLine="720"/>
+      <w:jc w:val="center"/>
+    </w:pPr>
+    <w:rPr>
+      <w:rFonts w:ascii="Times New Roman" w:eastAsiaTheme="minorHAnsi" w:hAnsi="Times New Roman" w:cstheme="minorBidi"/>
+      <w:b/>
+      <w:color w:val="auto"/>
+      <w:sz w:val="32"/>
+      <w:szCs w:val="22"/>
+      <w:lang w:eastAsia="en-US"/>
+    </w:rPr>
+  </w:style>
+  <w:style w:type="character" w:customStyle="1" w:styleId="0LV1Char">
+    <w:name w:val="0LV1 Char"/>
+    <w:basedOn w:val="DefaultParagraphFont"/>
+    <w:link w:val="0LV1"/>
+    <w:rsid w:val="008C1C00"/>
+    <w:rPr>
+      <w:rFonts w:ascii="Times New Roman" w:eastAsiaTheme="minorHAnsi" w:hAnsi="Times New Roman"/>
+      <w:b/>
+      <w:kern w:val="0"/>
+      <w:sz w:val="32"/>
+      <w:szCs w:val="22"/>
+      <w:lang w:val="en-US" w:eastAsia="en-US"/>
+      <w14:ligatures w14:val="none"/>
+    </w:rPr>
+  </w:style>
   <w:style w:type="character" w:customStyle="1" w:styleId="Heading4Char">
     <w:name w:val="Heading 4 Char"/>
     <w:basedOn w:val="DefaultParagraphFont"/>
     <w:link w:val="Heading4"/>
     <w:uiPriority w:val="9"/>
     <w:semiHidden/>
-    <w:rsid w:val="00B81830"/>
+    <w:rsid w:val="00E918B2"/>
     <w:rPr>
       <w:rFonts w:eastAsiaTheme="majorEastAsia" w:cstheme="majorBidi"/>
       <w:i/>
       <w:iCs/>
       <w:color w:val="0F4761" w:themeColor="accent1" w:themeShade="BF"/>
-      <w:kern w:val="0"/>
-      <w:sz w:val="22"/>
-      <w:szCs w:val="22"/>
-      <w:lang w:val="en-US"/>
       <w14:ligatures w14:val="none"/>
     </w:rPr>
   </w:style>
@@ -896,14 +920,10 @@
     <w:link w:val="Heading5"/>
     <w:uiPriority w:val="9"/>
     <w:semiHidden/>
-    <w:rsid w:val="00B81830"/>
+    <w:rsid w:val="00E918B2"/>
     <w:rPr>
       <w:rFonts w:eastAsiaTheme="majorEastAsia" w:cstheme="majorBidi"/>
       <w:color w:val="0F4761" w:themeColor="accent1" w:themeShade="BF"/>
-      <w:kern w:val="0"/>
-      <w:sz w:val="22"/>
-      <w:szCs w:val="22"/>
-      <w:lang w:val="en-US"/>
       <w14:ligatures w14:val="none"/>
     </w:rPr>
   </w:style>
@@ -913,16 +933,12 @@
     <w:link w:val="Heading6"/>
     <w:uiPriority w:val="9"/>
     <w:semiHidden/>
-    <w:rsid w:val="00B81830"/>
+    <w:rsid w:val="00E918B2"/>
     <w:rPr>
       <w:rFonts w:eastAsiaTheme="majorEastAsia" w:cstheme="majorBidi"/>
       <w:i/>
       <w:iCs/>
       <w:color w:val="595959" w:themeColor="text1" w:themeTint="A6"/>
-      <w:kern w:val="0"/>
-      <w:sz w:val="22"/>
-      <w:szCs w:val="22"/>
-      <w:lang w:val="en-US"/>
       <w14:ligatures w14:val="none"/>
     </w:rPr>
   </w:style>
@@ -932,14 +948,10 @@
     <w:link w:val="Heading7"/>
     <w:uiPriority w:val="9"/>
     <w:semiHidden/>
-    <w:rsid w:val="00B81830"/>
+    <w:rsid w:val="00E918B2"/>
     <w:rPr>
       <w:rFonts w:eastAsiaTheme="majorEastAsia" w:cstheme="majorBidi"/>
       <w:color w:val="595959" w:themeColor="text1" w:themeTint="A6"/>
-      <w:kern w:val="0"/>
-      <w:sz w:val="22"/>
-      <w:szCs w:val="22"/>
-      <w:lang w:val="en-US"/>
       <w14:ligatures w14:val="none"/>
     </w:rPr>
   </w:style>
@@ -949,16 +961,12 @@
     <w:link w:val="Heading8"/>
     <w:uiPriority w:val="9"/>
     <w:semiHidden/>
-    <w:rsid w:val="00B81830"/>
+    <w:rsid w:val="00E918B2"/>
     <w:rPr>
       <w:rFonts w:eastAsiaTheme="majorEastAsia" w:cstheme="majorBidi"/>
       <w:i/>
       <w:iCs/>
       <w:color w:val="272727" w:themeColor="text1" w:themeTint="D8"/>
-      <w:kern w:val="0"/>
-      <w:sz w:val="22"/>
-      <w:szCs w:val="22"/>
-      <w:lang w:val="en-US"/>
       <w14:ligatures w14:val="none"/>
     </w:rPr>
   </w:style>
@@ -968,14 +976,10 @@
     <w:link w:val="Heading9"/>
     <w:uiPriority w:val="9"/>
     <w:semiHidden/>
-    <w:rsid w:val="00B81830"/>
+    <w:rsid w:val="00E918B2"/>
     <w:rPr>
       <w:rFonts w:eastAsiaTheme="majorEastAsia" w:cstheme="majorBidi"/>
       <w:color w:val="272727" w:themeColor="text1" w:themeTint="D8"/>
-      <w:kern w:val="0"/>
-      <w:sz w:val="22"/>
-      <w:szCs w:val="22"/>
-      <w:lang w:val="en-US"/>
       <w14:ligatures w14:val="none"/>
     </w:rPr>
   </w:style>
@@ -986,7 +990,7 @@
     <w:link w:val="TitleChar"/>
     <w:uiPriority w:val="10"/>
     <w:qFormat/>
-    <w:rsid w:val="00B81830"/>
+    <w:rsid w:val="00E918B2"/>
     <w:pPr>
       <w:spacing w:after="80" w:line="240" w:lineRule="auto"/>
       <w:contextualSpacing/>
@@ -1004,14 +1008,13 @@
     <w:basedOn w:val="DefaultParagraphFont"/>
     <w:link w:val="Title"/>
     <w:uiPriority w:val="10"/>
-    <w:rsid w:val="00B81830"/>
+    <w:rsid w:val="00E918B2"/>
     <w:rPr>
       <w:rFonts w:asciiTheme="majorHAnsi" w:eastAsiaTheme="majorEastAsia" w:hAnsiTheme="majorHAnsi" w:cstheme="majorBidi"/>
       <w:spacing w:val="-10"/>
       <w:kern w:val="28"/>
       <w:sz w:val="56"/>
       <w:szCs w:val="56"/>
-      <w:lang w:val="en-US"/>
       <w14:ligatures w14:val="none"/>
     </w:rPr>
   </w:style>
@@ -1022,7 +1025,7 @@
     <w:link w:val="SubtitleChar"/>
     <w:uiPriority w:val="11"/>
     <w:qFormat/>
-    <w:rsid w:val="00B81830"/>
+    <w:rsid w:val="00E918B2"/>
     <w:pPr>
       <w:numPr>
         <w:ilvl w:val="1"/>
@@ -1042,15 +1045,13 @@
     <w:basedOn w:val="DefaultParagraphFont"/>
     <w:link w:val="Subtitle"/>
     <w:uiPriority w:val="11"/>
-    <w:rsid w:val="00B81830"/>
+    <w:rsid w:val="00E918B2"/>
     <w:rPr>
       <w:rFonts w:eastAsiaTheme="majorEastAsia" w:cstheme="majorBidi"/>
       <w:color w:val="595959" w:themeColor="text1" w:themeTint="A6"/>
       <w:spacing w:val="15"/>
-      <w:kern w:val="0"/>
       <w:sz w:val="28"/>
       <w:szCs w:val="28"/>
-      <w:lang w:val="en-US"/>
       <w14:ligatures w14:val="none"/>
     </w:rPr>
   </w:style>
@@ -1061,7 +1062,7 @@
     <w:link w:val="QuoteChar"/>
     <w:uiPriority w:val="29"/>
     <w:qFormat/>
-    <w:rsid w:val="00B81830"/>
+    <w:rsid w:val="00E918B2"/>
     <w:pPr>
       <w:spacing w:before="160" w:after="160"/>
       <w:jc w:val="center"/>
@@ -1077,16 +1078,12 @@
     <w:basedOn w:val="DefaultParagraphFont"/>
     <w:link w:val="Quote"/>
     <w:uiPriority w:val="29"/>
-    <w:rsid w:val="00B81830"/>
+    <w:rsid w:val="00E918B2"/>
     <w:rPr>
       <w:rFonts w:ascii="Calibri" w:hAnsi="Calibri" w:cs="Times New Roman"/>
       <w:i/>
       <w:iCs/>
       <w:color w:val="404040" w:themeColor="text1" w:themeTint="BF"/>
-      <w:kern w:val="0"/>
-      <w:sz w:val="22"/>
-      <w:szCs w:val="22"/>
-      <w:lang w:val="en-US"/>
       <w14:ligatures w14:val="none"/>
     </w:rPr>
   </w:style>
@@ -1095,7 +1092,7 @@
     <w:basedOn w:val="Normal"/>
     <w:uiPriority w:val="34"/>
     <w:qFormat/>
-    <w:rsid w:val="00B81830"/>
+    <w:rsid w:val="00E918B2"/>
     <w:pPr>
       <w:ind w:left="720"/>
       <w:contextualSpacing/>
@@ -1106,7 +1103,7 @@
     <w:basedOn w:val="DefaultParagraphFont"/>
     <w:uiPriority w:val="21"/>
     <w:qFormat/>
-    <w:rsid w:val="00B81830"/>
+    <w:rsid w:val="00E918B2"/>
     <w:rPr>
       <w:i/>
       <w:iCs/>
@@ -1120,7 +1117,7 @@
     <w:link w:val="IntenseQuoteChar"/>
     <w:uiPriority w:val="30"/>
     <w:qFormat/>
-    <w:rsid w:val="00B81830"/>
+    <w:rsid w:val="00E918B2"/>
     <w:pPr>
       <w:pBdr>
         <w:top w:val="single" w:sz="4" w:space="10" w:color="0F4761" w:themeColor="accent1" w:themeShade="BF"/>
@@ -1141,16 +1138,12 @@
     <w:basedOn w:val="DefaultParagraphFont"/>
     <w:link w:val="IntenseQuote"/>
     <w:uiPriority w:val="30"/>
-    <w:rsid w:val="00B81830"/>
+    <w:rsid w:val="00E918B2"/>
     <w:rPr>
       <w:rFonts w:ascii="Calibri" w:hAnsi="Calibri" w:cs="Times New Roman"/>
       <w:i/>
       <w:iCs/>
       <w:color w:val="0F4761" w:themeColor="accent1" w:themeShade="BF"/>
-      <w:kern w:val="0"/>
-      <w:sz w:val="22"/>
-      <w:szCs w:val="22"/>
-      <w:lang w:val="en-US"/>
       <w14:ligatures w14:val="none"/>
     </w:rPr>
   </w:style>
@@ -1159,7 +1152,7 @@
     <w:basedOn w:val="DefaultParagraphFont"/>
     <w:uiPriority w:val="32"/>
     <w:qFormat/>
-    <w:rsid w:val="00B81830"/>
+    <w:rsid w:val="00E918B2"/>
     <w:rPr>
       <w:b/>
       <w:bCs/>
@@ -1174,7 +1167,7 @@
     <w:link w:val="HeaderChar"/>
     <w:uiPriority w:val="99"/>
     <w:unhideWhenUsed/>
-    <w:rsid w:val="00EE1B36"/>
+    <w:rsid w:val="007E484D"/>
     <w:pPr>
       <w:tabs>
         <w:tab w:val="center" w:pos="4680"/>
@@ -1188,13 +1181,9 @@
     <w:basedOn w:val="DefaultParagraphFont"/>
     <w:link w:val="Header"/>
     <w:uiPriority w:val="99"/>
-    <w:rsid w:val="00EE1B36"/>
+    <w:rsid w:val="007E484D"/>
     <w:rPr>
       <w:rFonts w:ascii="Calibri" w:hAnsi="Calibri" w:cs="Times New Roman"/>
-      <w:kern w:val="0"/>
-      <w:sz w:val="22"/>
-      <w:szCs w:val="22"/>
-      <w:lang w:val="en-US"/>
       <w14:ligatures w14:val="none"/>
     </w:rPr>
   </w:style>
@@ -1204,7 +1193,7 @@
     <w:link w:val="FooterChar"/>
     <w:uiPriority w:val="99"/>
     <w:unhideWhenUsed/>
-    <w:rsid w:val="00EE1B36"/>
+    <w:rsid w:val="007E484D"/>
     <w:pPr>
       <w:tabs>
         <w:tab w:val="center" w:pos="4680"/>
@@ -1218,13 +1207,9 @@
     <w:basedOn w:val="DefaultParagraphFont"/>
     <w:link w:val="Footer"/>
     <w:uiPriority w:val="99"/>
-    <w:rsid w:val="00EE1B36"/>
+    <w:rsid w:val="007E484D"/>
     <w:rPr>
       <w:rFonts w:ascii="Calibri" w:hAnsi="Calibri" w:cs="Times New Roman"/>
-      <w:kern w:val="0"/>
-      <w:sz w:val="22"/>
-      <w:szCs w:val="22"/>
-      <w:lang w:val="en-US"/>
       <w14:ligatures w14:val="none"/>
     </w:rPr>
   </w:style>

</xml_diff>